<commit_message>
cambios citas README Y GUIA
</commit_message>
<xml_diff>
--- a/docs/guia_materiales_taller4.docx
+++ b/docs/guia_materiales_taller4.docx
@@ -98,6 +98,9 @@
       <w:pPr>
         <w:spacing w:after="80" w:line="276" w:lineRule="auto"/>
         <w:jc w:val="both"/>
+        <w:rPr>
+          <w:color w:val="000000"/>
+        </w:rPr>
       </w:pPr>
       <w:r>
         <w:rPr>
@@ -271,7 +274,7 @@
         <w:rPr>
           <w:color w:val="000000"/>
         </w:rPr>
-        <w:t xml:space="preserve"> sea cognitivamente demandante. Wessel (2018) es la referencia metodológica utilizada en el taller.</w:t>
+        <w:t xml:space="preserve"> sea cognitivamente demandante. El control inhibitorio es una de las tres funciones ejecutivas centrales revisadas por Diamond (2013), y constituye la función directamente medida por este paradigma. Wessel (2018) es la referencia metodológica utilizada en el taller.</w:t>
       </w:r>
     </w:p>
     <w:p>
@@ -339,16 +342,7 @@
                 <w:sz w:val="22"/>
                 <w:szCs w:val="22"/>
               </w:rPr>
-              <w:t xml:space="preserve">El </w:t>
-            </w:r>
-            <w:proofErr w:type="gramStart"/>
-            <w:r>
-              <w:rPr>
-                <w:color w:val="000000"/>
-                <w:sz w:val="22"/>
-                <w:szCs w:val="22"/>
-              </w:rPr>
-              <w:t>archivo .</w:t>
+              <w:t>El archivo .</w:t>
             </w:r>
             <w:proofErr w:type="spellStart"/>
             <w:r>
@@ -360,7 +354,6 @@
               <w:t>psyexp</w:t>
             </w:r>
             <w:proofErr w:type="spellEnd"/>
-            <w:proofErr w:type="gramEnd"/>
             <w:r>
               <w:rPr>
                 <w:color w:val="000000"/>
@@ -533,17 +526,9 @@
         <w:rPr>
           <w:color w:val="000000"/>
         </w:rPr>
-        <w:t>gonogo_</w:t>
-      </w:r>
-      <w:proofErr w:type="gramStart"/>
-      <w:r>
-        <w:rPr>
-          <w:color w:val="000000"/>
-        </w:rPr>
-        <w:t>task.psyexp</w:t>
+        <w:t>gonogo_task.psyexp</w:t>
       </w:r>
       <w:proofErr w:type="spellEnd"/>
-      <w:proofErr w:type="gramEnd"/>
       <w:r>
         <w:rPr>
           <w:color w:val="000000"/>
@@ -753,20 +738,9 @@
                 <w:sz w:val="20"/>
                 <w:szCs w:val="20"/>
               </w:rPr>
-              <w:t>gonogo_</w:t>
-            </w:r>
-            <w:proofErr w:type="gramStart"/>
-            <w:r>
-              <w:rPr>
-                <w:rFonts w:ascii="Courier New" w:eastAsia="Courier New" w:hAnsi="Courier New" w:cs="Courier New"/>
-                <w:color w:val="000000"/>
-                <w:sz w:val="20"/>
-                <w:szCs w:val="20"/>
-              </w:rPr>
-              <w:t>task.psyexp</w:t>
-            </w:r>
-            <w:proofErr w:type="spellEnd"/>
-            <w:proofErr w:type="gramEnd"/>
+              <w:t>gonogo_task.psyexp</w:t>
+            </w:r>
+            <w:proofErr w:type="spellEnd"/>
           </w:p>
           <w:p>
             <w:pPr>
@@ -787,36 +761,48 @@
             <w:pPr>
               <w:spacing w:before="20" w:after="20"/>
               <w:jc w:val="both"/>
-              <w:rPr>
-                <w:lang w:val="en-US"/>
-              </w:rPr>
-            </w:pPr>
-            <w:r>
-              <w:rPr>
-                <w:rFonts w:ascii="Courier New" w:eastAsia="Courier New" w:hAnsi="Courier New" w:cs="Courier New"/>
-                <w:color w:val="000000"/>
-                <w:sz w:val="20"/>
-                <w:szCs w:val="20"/>
-                <w:lang w:val="en-US"/>
-              </w:rPr>
-              <w:t>├── conditions/</w:t>
+            </w:pPr>
+            <w:r>
+              <w:rPr>
+                <w:rFonts w:ascii="Courier New" w:eastAsia="Courier New" w:hAnsi="Courier New" w:cs="Courier New"/>
+                <w:color w:val="000000"/>
+                <w:sz w:val="20"/>
+                <w:szCs w:val="20"/>
+              </w:rPr>
+              <w:t xml:space="preserve">├── </w:t>
+            </w:r>
+            <w:proofErr w:type="spellStart"/>
+            <w:r>
+              <w:rPr>
+                <w:rFonts w:ascii="Courier New" w:eastAsia="Courier New" w:hAnsi="Courier New" w:cs="Courier New"/>
+                <w:color w:val="000000"/>
+                <w:sz w:val="20"/>
+                <w:szCs w:val="20"/>
+              </w:rPr>
+              <w:t>conditions</w:t>
+            </w:r>
+            <w:proofErr w:type="spellEnd"/>
+            <w:r>
+              <w:rPr>
+                <w:rFonts w:ascii="Courier New" w:eastAsia="Courier New" w:hAnsi="Courier New" w:cs="Courier New"/>
+                <w:color w:val="000000"/>
+                <w:sz w:val="20"/>
+                <w:szCs w:val="20"/>
+              </w:rPr>
+              <w:t>/</w:t>
             </w:r>
           </w:p>
           <w:p>
             <w:pPr>
               <w:spacing w:before="20" w:after="20"/>
               <w:jc w:val="both"/>
-              <w:rPr>
-                <w:lang w:val="en-US"/>
-              </w:rPr>
-            </w:pPr>
-            <w:r>
-              <w:rPr>
-                <w:rFonts w:ascii="Courier New" w:eastAsia="Courier New" w:hAnsi="Courier New" w:cs="Courier New"/>
-                <w:color w:val="000000"/>
-                <w:sz w:val="20"/>
-                <w:szCs w:val="20"/>
-                <w:lang w:val="en-US"/>
+            </w:pPr>
+            <w:r>
+              <w:rPr>
+                <w:rFonts w:ascii="Courier New" w:eastAsia="Courier New" w:hAnsi="Courier New" w:cs="Courier New"/>
+                <w:color w:val="000000"/>
+                <w:sz w:val="20"/>
+                <w:szCs w:val="20"/>
               </w:rPr>
               <w:t xml:space="preserve">│   ├── </w:t>
             </w:r>
@@ -826,7 +812,6 @@
                 <w:color w:val="000000"/>
                 <w:sz w:val="20"/>
                 <w:szCs w:val="20"/>
-                <w:lang w:val="en-US"/>
               </w:rPr>
               <w:t>condiciones_</w:t>
             </w:r>
@@ -836,31 +821,68 @@
                 <w:color w:val="000000"/>
                 <w:sz w:val="20"/>
                 <w:szCs w:val="20"/>
-                <w:lang w:val="en-US"/>
-              </w:rPr>
-              <w:t xml:space="preserve">practica.xlsx           </w:t>
-            </w:r>
-            <w:proofErr w:type="gramStart"/>
-            <w:r>
-              <w:rPr>
-                <w:rFonts w:ascii="Courier New" w:eastAsia="Courier New" w:hAnsi="Courier New" w:cs="Courier New"/>
-                <w:color w:val="000000"/>
-                <w:sz w:val="20"/>
-                <w:szCs w:val="20"/>
-                <w:lang w:val="en-US"/>
-              </w:rPr>
-              <w:t xml:space="preserve">   (</w:t>
-            </w:r>
-            <w:proofErr w:type="gramEnd"/>
-            <w:r>
-              <w:rPr>
-                <w:rFonts w:ascii="Courier New" w:eastAsia="Courier New" w:hAnsi="Courier New" w:cs="Courier New"/>
-                <w:color w:val="000000"/>
-                <w:sz w:val="20"/>
-                <w:szCs w:val="20"/>
-                <w:lang w:val="en-US"/>
-              </w:rPr>
-              <w:t>20 trials — 16 Go + 4 No-Go)</w:t>
+              </w:rPr>
+              <w:t xml:space="preserve">practica.xlsx              (20 </w:t>
+            </w:r>
+            <w:proofErr w:type="spellStart"/>
+            <w:r>
+              <w:rPr>
+                <w:rFonts w:ascii="Courier New" w:eastAsia="Courier New" w:hAnsi="Courier New" w:cs="Courier New"/>
+                <w:color w:val="000000"/>
+                <w:sz w:val="20"/>
+                <w:szCs w:val="20"/>
+              </w:rPr>
+              <w:t>trials</w:t>
+            </w:r>
+            <w:proofErr w:type="spellEnd"/>
+            <w:r>
+              <w:rPr>
+                <w:rFonts w:ascii="Courier New" w:eastAsia="Courier New" w:hAnsi="Courier New" w:cs="Courier New"/>
+                <w:color w:val="000000"/>
+                <w:sz w:val="20"/>
+                <w:szCs w:val="20"/>
+              </w:rPr>
+              <w:t xml:space="preserve"> — 16 </w:t>
+            </w:r>
+            <w:proofErr w:type="spellStart"/>
+            <w:r>
+              <w:rPr>
+                <w:rFonts w:ascii="Courier New" w:eastAsia="Courier New" w:hAnsi="Courier New" w:cs="Courier New"/>
+                <w:color w:val="000000"/>
+                <w:sz w:val="20"/>
+                <w:szCs w:val="20"/>
+              </w:rPr>
+              <w:t>Go</w:t>
+            </w:r>
+            <w:proofErr w:type="spellEnd"/>
+            <w:r>
+              <w:rPr>
+                <w:rFonts w:ascii="Courier New" w:eastAsia="Courier New" w:hAnsi="Courier New" w:cs="Courier New"/>
+                <w:color w:val="000000"/>
+                <w:sz w:val="20"/>
+                <w:szCs w:val="20"/>
+              </w:rPr>
+              <w:t xml:space="preserve"> + 4 No-</w:t>
+            </w:r>
+            <w:proofErr w:type="spellStart"/>
+            <w:r>
+              <w:rPr>
+                <w:rFonts w:ascii="Courier New" w:eastAsia="Courier New" w:hAnsi="Courier New" w:cs="Courier New"/>
+                <w:color w:val="000000"/>
+                <w:sz w:val="20"/>
+                <w:szCs w:val="20"/>
+              </w:rPr>
+              <w:t>Go</w:t>
+            </w:r>
+            <w:proofErr w:type="spellEnd"/>
+            <w:r>
+              <w:rPr>
+                <w:rFonts w:ascii="Courier New" w:eastAsia="Courier New" w:hAnsi="Courier New" w:cs="Courier New"/>
+                <w:color w:val="000000"/>
+                <w:sz w:val="20"/>
+                <w:szCs w:val="20"/>
+              </w:rPr>
+              <w:t>)</w:t>
             </w:r>
           </w:p>
           <w:p>
@@ -893,27 +915,7 @@
                 <w:sz w:val="20"/>
                 <w:szCs w:val="20"/>
               </w:rPr>
-              <w:t xml:space="preserve">experimental.xlsx      </w:t>
-            </w:r>
-            <w:proofErr w:type="gramStart"/>
-            <w:r>
-              <w:rPr>
-                <w:rFonts w:ascii="Courier New" w:eastAsia="Courier New" w:hAnsi="Courier New" w:cs="Courier New"/>
-                <w:color w:val="000000"/>
-                <w:sz w:val="20"/>
-                <w:szCs w:val="20"/>
-              </w:rPr>
-              <w:t xml:space="preserve">   (</w:t>
-            </w:r>
-            <w:proofErr w:type="gramEnd"/>
-            <w:r>
-              <w:rPr>
-                <w:rFonts w:ascii="Courier New" w:eastAsia="Courier New" w:hAnsi="Courier New" w:cs="Courier New"/>
-                <w:color w:val="000000"/>
-                <w:sz w:val="20"/>
-                <w:szCs w:val="20"/>
-              </w:rPr>
-              <w:t xml:space="preserve">80 </w:t>
+              <w:t xml:space="preserve">experimental.xlsx         (80 </w:t>
             </w:r>
             <w:proofErr w:type="spellStart"/>
             <w:r>
@@ -1053,6 +1055,7 @@
                 <w:sz w:val="20"/>
                 <w:szCs w:val="20"/>
               </w:rPr>
+              <w:lastRenderedPageBreak/>
               <w:t>│   │   ├── 1_instrucciones.png</w:t>
             </w:r>
           </w:p>
@@ -1068,7 +1071,6 @@
                 <w:sz w:val="20"/>
                 <w:szCs w:val="20"/>
               </w:rPr>
-              <w:lastRenderedPageBreak/>
               <w:t>│   │   ├── 2_instrucciones_practica.png</w:t>
             </w:r>
           </w:p>
@@ -1179,27 +1181,7 @@
                 <w:sz w:val="20"/>
                 <w:szCs w:val="20"/>
               </w:rPr>
-              <w:t xml:space="preserve">│       ├── go.png              </w:t>
-            </w:r>
-            <w:proofErr w:type="gramStart"/>
-            <w:r>
-              <w:rPr>
-                <w:rFonts w:ascii="Courier New" w:eastAsia="Courier New" w:hAnsi="Courier New" w:cs="Courier New"/>
-                <w:color w:val="000000"/>
-                <w:sz w:val="20"/>
-                <w:szCs w:val="20"/>
-              </w:rPr>
-              <w:t xml:space="preserve">   (</w:t>
-            </w:r>
-            <w:proofErr w:type="gramEnd"/>
-            <w:r>
-              <w:rPr>
-                <w:rFonts w:ascii="Courier New" w:eastAsia="Courier New" w:hAnsi="Courier New" w:cs="Courier New"/>
-                <w:color w:val="000000"/>
-                <w:sz w:val="20"/>
-                <w:szCs w:val="20"/>
-              </w:rPr>
-              <w:t xml:space="preserve">círculo verde #27AE60 — 500×500 </w:t>
+              <w:t xml:space="preserve">│       ├── go.png                 (círculo verde #27AE60 — 500×500 </w:t>
             </w:r>
             <w:proofErr w:type="spellStart"/>
             <w:r>
@@ -1234,27 +1216,7 @@
                 <w:sz w:val="20"/>
                 <w:szCs w:val="20"/>
               </w:rPr>
-              <w:t xml:space="preserve">│       └── nogo.png            </w:t>
-            </w:r>
-            <w:proofErr w:type="gramStart"/>
-            <w:r>
-              <w:rPr>
-                <w:rFonts w:ascii="Courier New" w:eastAsia="Courier New" w:hAnsi="Courier New" w:cs="Courier New"/>
-                <w:color w:val="000000"/>
-                <w:sz w:val="20"/>
-                <w:szCs w:val="20"/>
-              </w:rPr>
-              <w:t xml:space="preserve">   (</w:t>
-            </w:r>
-            <w:proofErr w:type="gramEnd"/>
-            <w:r>
-              <w:rPr>
-                <w:rFonts w:ascii="Courier New" w:eastAsia="Courier New" w:hAnsi="Courier New" w:cs="Courier New"/>
-                <w:color w:val="000000"/>
-                <w:sz w:val="20"/>
-                <w:szCs w:val="20"/>
-              </w:rPr>
-              <w:t xml:space="preserve">cuadrado rojo #C0392B — 500×500 </w:t>
+              <w:t xml:space="preserve">│       └── nogo.png               (cuadrado rojo #C0392B — 500×500 </w:t>
             </w:r>
             <w:proofErr w:type="spellStart"/>
             <w:r>
@@ -4415,47 +4377,7 @@
                 <w:sz w:val="20"/>
                 <w:szCs w:val="20"/>
               </w:rPr>
-              <w:t xml:space="preserve">/go.png    — Círculo </w:t>
-            </w:r>
-            <w:proofErr w:type="gramStart"/>
-            <w:r>
-              <w:rPr>
-                <w:rFonts w:ascii="Courier New" w:eastAsia="Courier New" w:hAnsi="Courier New" w:cs="Courier New"/>
-                <w:color w:val="000000"/>
-                <w:sz w:val="20"/>
-                <w:szCs w:val="20"/>
-              </w:rPr>
-              <w:t>verde  (</w:t>
-            </w:r>
-            <w:proofErr w:type="gramEnd"/>
-            <w:r>
-              <w:rPr>
-                <w:rFonts w:ascii="Courier New" w:eastAsia="Courier New" w:hAnsi="Courier New" w:cs="Courier New"/>
-                <w:color w:val="000000"/>
-                <w:sz w:val="20"/>
-                <w:szCs w:val="20"/>
-              </w:rPr>
-              <w:t>#27AE60</w:t>
-            </w:r>
-            <w:proofErr w:type="gramStart"/>
-            <w:r>
-              <w:rPr>
-                <w:rFonts w:ascii="Courier New" w:eastAsia="Courier New" w:hAnsi="Courier New" w:cs="Courier New"/>
-                <w:color w:val="000000"/>
-                <w:sz w:val="20"/>
-                <w:szCs w:val="20"/>
-              </w:rPr>
-              <w:t>)  —</w:t>
-            </w:r>
-            <w:proofErr w:type="gramEnd"/>
-            <w:r>
-              <w:rPr>
-                <w:rFonts w:ascii="Courier New" w:eastAsia="Courier New" w:hAnsi="Courier New" w:cs="Courier New"/>
-                <w:color w:val="000000"/>
-                <w:sz w:val="20"/>
-                <w:szCs w:val="20"/>
-              </w:rPr>
-              <w:t xml:space="preserve"> 380 </w:t>
+              <w:t xml:space="preserve">/go.png    — Círculo verde  (#27AE60)  — 380 </w:t>
             </w:r>
             <w:proofErr w:type="spellStart"/>
             <w:r>
@@ -4483,7 +4405,6 @@
               <w:spacing w:before="20" w:after="20"/>
               <w:jc w:val="both"/>
             </w:pPr>
-            <w:proofErr w:type="gramStart"/>
             <w:r>
               <w:rPr>
                 <w:rFonts w:ascii="Courier New" w:eastAsia="Courier New" w:hAnsi="Courier New" w:cs="Courier New"/>
@@ -4511,57 +4432,7 @@
                 <w:sz w:val="20"/>
                 <w:szCs w:val="20"/>
               </w:rPr>
-              <w:t>/nogo.png  —</w:t>
-            </w:r>
-            <w:proofErr w:type="gramEnd"/>
-            <w:r>
-              <w:rPr>
-                <w:rFonts w:ascii="Courier New" w:eastAsia="Courier New" w:hAnsi="Courier New" w:cs="Courier New"/>
-                <w:color w:val="000000"/>
-                <w:sz w:val="20"/>
-                <w:szCs w:val="20"/>
-              </w:rPr>
-              <w:t xml:space="preserve"> Cuadrado </w:t>
-            </w:r>
-            <w:proofErr w:type="gramStart"/>
-            <w:r>
-              <w:rPr>
-                <w:rFonts w:ascii="Courier New" w:eastAsia="Courier New" w:hAnsi="Courier New" w:cs="Courier New"/>
-                <w:color w:val="000000"/>
-                <w:sz w:val="20"/>
-                <w:szCs w:val="20"/>
-              </w:rPr>
-              <w:t>rojo  (</w:t>
-            </w:r>
-            <w:proofErr w:type="gramEnd"/>
-            <w:r>
-              <w:rPr>
-                <w:rFonts w:ascii="Courier New" w:eastAsia="Courier New" w:hAnsi="Courier New" w:cs="Courier New"/>
-                <w:color w:val="000000"/>
-                <w:sz w:val="20"/>
-                <w:szCs w:val="20"/>
-              </w:rPr>
-              <w:t>#C0392</w:t>
-            </w:r>
-            <w:proofErr w:type="gramStart"/>
-            <w:r>
-              <w:rPr>
-                <w:rFonts w:ascii="Courier New" w:eastAsia="Courier New" w:hAnsi="Courier New" w:cs="Courier New"/>
-                <w:color w:val="000000"/>
-                <w:sz w:val="20"/>
-                <w:szCs w:val="20"/>
-              </w:rPr>
-              <w:t>B)  —</w:t>
-            </w:r>
-            <w:proofErr w:type="gramEnd"/>
-            <w:r>
-              <w:rPr>
-                <w:rFonts w:ascii="Courier New" w:eastAsia="Courier New" w:hAnsi="Courier New" w:cs="Courier New"/>
-                <w:color w:val="000000"/>
-                <w:sz w:val="20"/>
-                <w:szCs w:val="20"/>
-              </w:rPr>
-              <w:t xml:space="preserve"> 380 </w:t>
+              <w:t xml:space="preserve">/nogo.png  — Cuadrado rojo  (#C0392B)  — 380 </w:t>
             </w:r>
             <w:proofErr w:type="spellStart"/>
             <w:r>
@@ -4676,25 +4547,14 @@
               <w:t>instructions</w:t>
             </w:r>
             <w:proofErr w:type="spellEnd"/>
-            <w:proofErr w:type="gramStart"/>
-            <w:r>
-              <w:rPr>
-                <w:rFonts w:ascii="Courier New" w:eastAsia="Courier New" w:hAnsi="Courier New" w:cs="Courier New"/>
-                <w:color w:val="000000"/>
-                <w:sz w:val="20"/>
-                <w:szCs w:val="20"/>
-              </w:rPr>
-              <w:t>/  —</w:t>
-            </w:r>
-            <w:proofErr w:type="gramEnd"/>
-            <w:r>
-              <w:rPr>
-                <w:rFonts w:ascii="Courier New" w:eastAsia="Courier New" w:hAnsi="Courier New" w:cs="Courier New"/>
-                <w:color w:val="000000"/>
-                <w:sz w:val="20"/>
-                <w:szCs w:val="20"/>
-              </w:rPr>
-              <w:t xml:space="preserve"> Imágenes de instrucciones preparadas en </w:t>
+            <w:r>
+              <w:rPr>
+                <w:rFonts w:ascii="Courier New" w:eastAsia="Courier New" w:hAnsi="Courier New" w:cs="Courier New"/>
+                <w:color w:val="000000"/>
+                <w:sz w:val="20"/>
+                <w:szCs w:val="20"/>
+              </w:rPr>
+              <w:t xml:space="preserve">/  — Imágenes de instrucciones preparadas en </w:t>
             </w:r>
             <w:proofErr w:type="spellStart"/>
             <w:r>
@@ -4813,37 +4673,17 @@
                 <w:sz w:val="20"/>
                 <w:szCs w:val="20"/>
               </w:rPr>
-              <w:t xml:space="preserve">  </w:t>
-            </w:r>
-            <w:proofErr w:type="gramStart"/>
-            <w:r>
-              <w:rPr>
-                <w:rFonts w:ascii="Courier New" w:eastAsia="Courier New" w:hAnsi="Courier New" w:cs="Courier New"/>
-                <w:color w:val="000000"/>
-                <w:sz w:val="20"/>
-                <w:szCs w:val="20"/>
-              </w:rPr>
-              <w:t xml:space="preserve">05_instrucciones_experimental.png  </w:t>
-            </w:r>
-            <w:proofErr w:type="spellStart"/>
-            <w:r>
-              <w:rPr>
-                <w:rFonts w:ascii="Courier New" w:eastAsia="Courier New" w:hAnsi="Courier New" w:cs="Courier New"/>
-                <w:color w:val="000000"/>
-                <w:sz w:val="20"/>
-                <w:szCs w:val="20"/>
-              </w:rPr>
-              <w:t>instrucciones</w:t>
-            </w:r>
-            <w:proofErr w:type="gramEnd"/>
-            <w:r>
-              <w:rPr>
-                <w:rFonts w:ascii="Courier New" w:eastAsia="Courier New" w:hAnsi="Courier New" w:cs="Courier New"/>
-                <w:color w:val="000000"/>
-                <w:sz w:val="20"/>
-                <w:szCs w:val="20"/>
-              </w:rPr>
-              <w:t>_experimental</w:t>
+              <w:t xml:space="preserve">  05_instrucciones_experimental.png  </w:t>
+            </w:r>
+            <w:proofErr w:type="spellStart"/>
+            <w:r>
+              <w:rPr>
+                <w:rFonts w:ascii="Courier New" w:eastAsia="Courier New" w:hAnsi="Courier New" w:cs="Courier New"/>
+                <w:color w:val="000000"/>
+                <w:sz w:val="20"/>
+                <w:szCs w:val="20"/>
+              </w:rPr>
+              <w:t>instrucciones_experimental</w:t>
             </w:r>
             <w:proofErr w:type="spellEnd"/>
           </w:p>
@@ -5383,6 +5223,56 @@
         <w:t>Referencias</w:t>
       </w:r>
       <w:proofErr w:type="spellEnd"/>
+    </w:p>
+    <w:p>
+      <w:pPr>
+        <w:spacing w:after="120" w:line="276" w:lineRule="auto"/>
+        <w:ind w:left="720" w:hanging="720"/>
+        <w:jc w:val="both"/>
+        <w:rPr>
+          <w:color w:val="000000"/>
+          <w:lang w:val="en-US"/>
+        </w:rPr>
+      </w:pPr>
+      <w:r>
+        <w:rPr>
+          <w:color w:val="000000"/>
+          <w:lang w:val="en-US"/>
+        </w:rPr>
+        <w:t xml:space="preserve">Diamond, A. (2013). Executive Functions. </w:t>
+      </w:r>
+      <w:r>
+        <w:rPr>
+          <w:i/>
+          <w:iCs/>
+          <w:color w:val="000000"/>
+          <w:lang w:val="en-US"/>
+        </w:rPr>
+        <w:t>Annual Review of Psychology</w:t>
+      </w:r>
+      <w:r>
+        <w:rPr>
+          <w:color w:val="000000"/>
+          <w:lang w:val="en-US"/>
+        </w:rPr>
+        <w:t xml:space="preserve">, </w:t>
+      </w:r>
+      <w:r>
+        <w:rPr>
+          <w:i/>
+          <w:iCs/>
+          <w:color w:val="000000"/>
+          <w:lang w:val="en-US"/>
+        </w:rPr>
+        <w:t>64</w:t>
+      </w:r>
+      <w:r>
+        <w:rPr>
+          <w:color w:val="000000"/>
+          <w:lang w:val="en-US"/>
+        </w:rPr>
+        <w:t>(Volume 64, 2013), 135–168. https://doi.org/10.1146/annurev-psych-113011-143750</w:t>
+      </w:r>
     </w:p>
     <w:p>
       <w:pPr>

</xml_diff>